<commit_message>
feat(main): add files lab-4
</commit_message>
<xml_diff>
--- a/labs/lab04/report/отчет_лаб4_Тимофеева_М_А_НБИбд02-25.docx
+++ b/labs/lab04/report/отчет_лаб4_Тимофеева_М_А_НБИбд02-25.docx
@@ -473,16 +473,7 @@
           <w:sz w:val="26"/>
           <w:u w:val="single"/>
         </w:rPr>
-        <w:t xml:space="preserve">Студент: </w:t>
-      </w:r>
-      <w:r>
-        <w:rPr>
-          <w:rFonts w:eastAsia="Droid Sans Fallb" w:cs="Times New Roman" w:ascii="Times New Roman" w:hAnsi="Times New Roman"/>
-          <w:color w:val="000000"/>
-          <w:sz w:val="26"/>
-          <w:u w:val="single"/>
-        </w:rPr>
-        <w:t xml:space="preserve">Тимофеева Милана Александровна </w:t>
+        <w:t xml:space="preserve">Студент: Тимофеева Милана Александровна </w:t>
       </w:r>
     </w:p>
     <w:p>
@@ -691,9 +682,6 @@
             </w:tabs>
             <w:rPr/>
           </w:pPr>
-          <w:r>
-            <w:br w:type="page"/>
-          </w:r>
           <w:r>
             <w:fldChar w:fldCharType="begin"/>
           </w:r>
@@ -1003,7 +991,7 @@
     <w:p>
       <w:pPr>
         <w:pStyle w:val="Heading1"/>
-        <w:spacing w:lineRule="auto" w:line="360"/>
+        <w:spacing w:lineRule="auto" w:line="360" w:before="0" w:after="120"/>
         <w:ind w:left="709"/>
         <w:jc w:val="both"/>
         <w:rPr>
@@ -1254,7 +1242,7 @@
     <w:p>
       <w:pPr>
         <w:pStyle w:val="Textbody"/>
-        <w:spacing w:lineRule="auto" w:line="360"/>
+        <w:spacing w:lineRule="auto" w:line="360" w:before="0" w:after="140"/>
         <w:jc w:val="both"/>
         <w:rPr>
           <w:rFonts w:ascii="Times New Roman" w:hAnsi="Times New Roman"/>
@@ -1314,7 +1302,9 @@
                               </w:rPr>
                             </w:pPr>
                             <w:r>
-                              <w:rPr/>
+                              <w:rPr>
+                                <w:color w:val="000000"/>
+                              </w:rPr>
                               <w:drawing>
                                 <wp:inline distT="0" distB="0" distL="0" distR="0">
                                   <wp:extent cx="4876800" cy="3352800"/>
@@ -1357,6 +1347,7 @@
                             <w:r>
                               <w:rPr>
                                 <w:rFonts w:ascii="Times New Roman" w:hAnsi="Times New Roman"/>
+                                <w:color w:val="000000"/>
                                 <w:sz w:val="26"/>
                                 <w:szCs w:val="26"/>
                               </w:rPr>
@@ -1376,7 +1367,7 @@
           </mc:Choice>
           <mc:Fallback>
             <w:pict>
-              <v:rect id="shape_0" ID="Врезка1" path="m0,0l-2147483645,0l-2147483645,-2147483646l0,-2147483646xe" stroked="f" o:allowincell="f" style="position:absolute;margin-left:29.9pt;margin-top:0pt;width:407.85pt;height:287.6pt;mso-wrap-style:none;v-text-anchor:top;mso-position-horizontal:center;mso-position-vertical:top" wp14:anchorId="1CA59116">
+              <v:rect id="shape_0" ID="Врезка1" path="m0,0l-2147483645,0l-2147483645,-2147483646l0,-2147483646xe" stroked="f" o:allowincell="f" style="position:absolute;margin-left:29.9pt;margin-top:0.05pt;width:407.85pt;height:287.6pt;mso-wrap-style:square;v-text-anchor:top;mso-position-horizontal:center" wp14:anchorId="1CA59116">
                 <v:fill o:detectmouseclick="t" on="false"/>
                 <v:stroke color="#3465a4" joinstyle="round" endcap="flat"/>
                 <v:textbox>
@@ -1392,7 +1383,9 @@
                         </w:rPr>
                       </w:pPr>
                       <w:r>
-                        <w:rPr/>
+                        <w:rPr>
+                          <w:color w:val="000000"/>
+                        </w:rPr>
                         <w:drawing>
                           <wp:inline distT="0" distB="0" distL="0" distR="0">
                             <wp:extent cx="4876800" cy="3352800"/>
@@ -1435,6 +1428,7 @@
                       <w:r>
                         <w:rPr>
                           <w:rFonts w:ascii="Times New Roman" w:hAnsi="Times New Roman"/>
+                          <w:color w:val="000000"/>
                           <w:sz w:val="26"/>
                           <w:szCs w:val="26"/>
                         </w:rPr>
@@ -1608,7 +1602,7 @@
         <mc:AlternateContent>
           <mc:Choice Requires="wps">
             <w:drawing>
-              <wp:anchor behindDoc="0" distT="0" distB="10160" distL="114300" distR="114300" simplePos="0" locked="0" layoutInCell="0" allowOverlap="1" relativeHeight="2" wp14:anchorId="38AEEAF3">
+              <wp:anchor behindDoc="0" distT="0" distB="19685" distL="114300" distR="114300" simplePos="0" locked="0" layoutInCell="0" allowOverlap="1" relativeHeight="2" wp14:anchorId="38AEEAF3">
                 <wp:simplePos x="0" y="0"/>
                 <wp:positionH relativeFrom="column">
                   <wp:align>center</wp:align>
@@ -1656,7 +1650,9 @@
                               </w:rPr>
                             </w:pPr>
                             <w:r>
-                              <w:rPr/>
+                              <w:rPr>
+                                <w:color w:val="000000"/>
+                              </w:rPr>
                               <w:drawing>
                                 <wp:inline distT="0" distB="0" distL="0" distR="0">
                                   <wp:extent cx="5162550" cy="1609725"/>
@@ -1699,6 +1695,7 @@
                             <w:r>
                               <w:rPr>
                                 <w:rFonts w:ascii="Times New Roman" w:hAnsi="Times New Roman"/>
+                                <w:color w:val="000000"/>
                                 <w:sz w:val="26"/>
                                 <w:szCs w:val="26"/>
                               </w:rPr>
@@ -1718,7 +1715,7 @@
           </mc:Choice>
           <mc:Fallback>
             <w:pict>
-              <v:rect id="shape_0" ID="Врезка2" path="m0,0l-2147483645,0l-2147483645,-2147483646l0,-2147483646xe" stroked="f" o:allowincell="f" style="position:absolute;margin-left:10pt;margin-top:0pt;width:447.65pt;height:150.35pt;mso-wrap-style:none;v-text-anchor:top;mso-position-horizontal:center;mso-position-vertical:top" wp14:anchorId="38AEEAF3">
+              <v:rect id="shape_0" ID="Врезка2" path="m0,0l-2147483645,0l-2147483645,-2147483646l0,-2147483646xe" stroked="f" o:allowincell="f" style="position:absolute;margin-left:10pt;margin-top:0.05pt;width:447.65pt;height:150.35pt;mso-wrap-style:square;v-text-anchor:top;mso-position-horizontal:center" wp14:anchorId="38AEEAF3">
                 <v:fill o:detectmouseclick="t" on="false"/>
                 <v:stroke color="#3465a4" joinstyle="round" endcap="flat"/>
                 <v:textbox>
@@ -1734,7 +1731,9 @@
                         </w:rPr>
                       </w:pPr>
                       <w:r>
-                        <w:rPr/>
+                        <w:rPr>
+                          <w:color w:val="000000"/>
+                        </w:rPr>
                         <w:drawing>
                           <wp:inline distT="0" distB="0" distL="0" distR="0">
                             <wp:extent cx="5162550" cy="1609725"/>
@@ -1777,6 +1776,7 @@
                       <w:r>
                         <w:rPr>
                           <w:rFonts w:ascii="Times New Roman" w:hAnsi="Times New Roman"/>
+                          <w:color w:val="000000"/>
                           <w:sz w:val="26"/>
                           <w:szCs w:val="26"/>
                         </w:rPr>
@@ -1806,7 +1806,7 @@
     <w:p>
       <w:pPr>
         <w:pStyle w:val="Textbody"/>
-        <w:spacing w:lineRule="auto" w:line="360"/>
+        <w:spacing w:lineRule="auto" w:line="360" w:before="0" w:after="140"/>
         <w:ind w:left="709"/>
         <w:jc w:val="both"/>
         <w:rPr>
@@ -2696,7 +2696,9 @@
                               </w:rPr>
                             </w:pPr>
                             <w:r>
-                              <w:rPr/>
+                              <w:rPr>
+                                <w:color w:val="000000"/>
+                              </w:rPr>
                               <w:drawing>
                                 <wp:inline distT="0" distB="0" distL="0" distR="0">
                                   <wp:extent cx="5162550" cy="2933700"/>
@@ -2739,6 +2741,7 @@
                             <w:r>
                               <w:rPr>
                                 <w:rFonts w:ascii="Times New Roman" w:hAnsi="Times New Roman"/>
+                                <w:color w:val="000000"/>
                                 <w:sz w:val="26"/>
                                 <w:szCs w:val="26"/>
                               </w:rPr>
@@ -2758,7 +2761,7 @@
           </mc:Choice>
           <mc:Fallback>
             <w:pict>
-              <v:rect id="shape_0" ID="Врезка3" path="m0,0l-2147483645,0l-2147483645,-2147483646l0,-2147483646xe" stroked="f" o:allowincell="f" style="position:absolute;margin-left:12.95pt;margin-top:45.75pt;width:430.35pt;height:254.6pt;mso-wrap-style:none;v-text-anchor:top" wp14:anchorId="029D4750">
+              <v:rect id="shape_0" ID="Врезка3" path="m0,0l-2147483645,0l-2147483645,-2147483646l0,-2147483646xe" stroked="f" o:allowincell="f" style="position:absolute;margin-left:12.95pt;margin-top:45.75pt;width:430.35pt;height:254.6pt;mso-wrap-style:square;v-text-anchor:top" wp14:anchorId="029D4750">
                 <v:fill o:detectmouseclick="t" on="false"/>
                 <v:stroke color="#3465a4" joinstyle="round" endcap="flat"/>
                 <v:textbox>
@@ -2774,7 +2777,9 @@
                         </w:rPr>
                       </w:pPr>
                       <w:r>
-                        <w:rPr/>
+                        <w:rPr>
+                          <w:color w:val="000000"/>
+                        </w:rPr>
                         <w:drawing>
                           <wp:inline distT="0" distB="0" distL="0" distR="0">
                             <wp:extent cx="5162550" cy="2933700"/>
@@ -2817,6 +2822,7 @@
                       <w:r>
                         <w:rPr>
                           <w:rFonts w:ascii="Times New Roman" w:hAnsi="Times New Roman"/>
+                          <w:color w:val="000000"/>
                           <w:sz w:val="26"/>
                           <w:szCs w:val="26"/>
                         </w:rPr>
@@ -2846,6 +2852,7 @@
     <w:p>
       <w:pPr>
         <w:pStyle w:val="Textbody"/>
+        <w:spacing w:before="0" w:after="140"/>
         <w:jc w:val="both"/>
         <w:rPr>
           <w:rFonts w:ascii="Times New Roman" w:hAnsi="Times New Roman"/>
@@ -3025,6 +3032,7 @@
     <w:p>
       <w:pPr>
         <w:pStyle w:val="Heading1"/>
+        <w:spacing w:before="0" w:after="120"/>
         <w:ind w:left="709"/>
         <w:jc w:val="both"/>
         <w:rPr>
@@ -3096,23 +3104,7 @@
           <w:szCs w:val="26"/>
         </w:rPr>
         <w:tab/>
-        <w:t>-Создал</w:t>
-      </w:r>
-      <w:r>
-        <w:rPr>
-          <w:rFonts w:ascii="Times New Roman" w:hAnsi="Times New Roman"/>
-          <w:sz w:val="26"/>
-          <w:szCs w:val="26"/>
-        </w:rPr>
-        <w:t>а</w:t>
-      </w:r>
-      <w:r>
-        <w:rPr>
-          <w:rFonts w:ascii="Times New Roman" w:hAnsi="Times New Roman"/>
-          <w:sz w:val="26"/>
-          <w:szCs w:val="26"/>
-        </w:rPr>
-        <w:t xml:space="preserve"> каталог для работы с программами на языке ассемблера NASM: (рис. 3.1.)</w:t>
+        <w:t>-Создала каталог для работы с программами на языке ассемблера NASM: (рис. 3.1.)</w:t>
       </w:r>
     </w:p>
     <w:p>
@@ -3155,23 +3147,7 @@
           <w:szCs w:val="26"/>
         </w:rPr>
         <w:tab/>
-        <w:t>-Перешел</w:t>
-      </w:r>
-      <w:r>
-        <w:rPr>
-          <w:rFonts w:ascii="Times New Roman" w:hAnsi="Times New Roman"/>
-          <w:sz w:val="26"/>
-          <w:szCs w:val="26"/>
-        </w:rPr>
-        <w:t>а</w:t>
-      </w:r>
-      <w:r>
-        <w:rPr>
-          <w:rFonts w:ascii="Times New Roman" w:hAnsi="Times New Roman"/>
-          <w:sz w:val="26"/>
-          <w:szCs w:val="26"/>
-        </w:rPr>
-        <w:t xml:space="preserve"> в созданный каталог:</w:t>
+        <w:t>-Перешела в созданный каталог:</w:t>
       </w:r>
     </w:p>
     <w:p>
@@ -3214,23 +3190,7 @@
           <w:szCs w:val="26"/>
         </w:rPr>
         <w:tab/>
-        <w:t>-Создал</w:t>
-      </w:r>
-      <w:r>
-        <w:rPr>
-          <w:rFonts w:ascii="Times New Roman" w:hAnsi="Times New Roman"/>
-          <w:sz w:val="26"/>
-          <w:szCs w:val="26"/>
-        </w:rPr>
-        <w:t>а</w:t>
-      </w:r>
-      <w:r>
-        <w:rPr>
-          <w:rFonts w:ascii="Times New Roman" w:hAnsi="Times New Roman"/>
-          <w:sz w:val="26"/>
-          <w:szCs w:val="26"/>
-        </w:rPr>
-        <w:t xml:space="preserve"> текстовый файл с именем hello.asm:</w:t>
+        <w:t>-Создала текстовый файл с именем hello.asm:</w:t>
       </w:r>
     </w:p>
     <w:p>
@@ -3273,23 +3233,7 @@
           <w:szCs w:val="26"/>
         </w:rPr>
         <w:tab/>
-        <w:t>-Открыл</w:t>
-      </w:r>
-      <w:r>
-        <w:rPr>
-          <w:rFonts w:ascii="Times New Roman" w:hAnsi="Times New Roman"/>
-          <w:sz w:val="26"/>
-          <w:szCs w:val="26"/>
-        </w:rPr>
-        <w:t>а</w:t>
-      </w:r>
-      <w:r>
-        <w:rPr>
-          <w:rFonts w:ascii="Times New Roman" w:hAnsi="Times New Roman"/>
-          <w:sz w:val="26"/>
-          <w:szCs w:val="26"/>
-        </w:rPr>
-        <w:t xml:space="preserve"> этот файл с помощью любого текстового редактора, например, gedit:</w:t>
+        <w:t>-Открыла этот файл с помощью любого текстового редактора, например, gedit:</w:t>
       </w:r>
     </w:p>
     <w:p>
@@ -3326,7 +3270,7 @@
       </w:pPr>
       <w:r>
         <w:drawing>
-          <wp:anchor behindDoc="0" distT="0" distB="0" distL="0" distR="0" simplePos="0" locked="0" layoutInCell="0" allowOverlap="1" relativeHeight="36">
+          <wp:anchor behindDoc="0" distT="0" distB="0" distL="0" distR="0" simplePos="0" locked="0" layoutInCell="0" allowOverlap="1" relativeHeight="26">
             <wp:simplePos x="0" y="0"/>
             <wp:positionH relativeFrom="column">
               <wp:posOffset>8255</wp:posOffset>
@@ -3399,23 +3343,7 @@
           <w:sz w:val="26"/>
           <w:szCs w:val="26"/>
         </w:rPr>
-        <w:t>и ввел</w:t>
-      </w:r>
-      <w:r>
-        <w:rPr>
-          <w:rFonts w:ascii="Times New Roman" w:hAnsi="Times New Roman"/>
-          <w:sz w:val="26"/>
-          <w:szCs w:val="26"/>
-        </w:rPr>
-        <w:t>а</w:t>
-      </w:r>
-      <w:r>
-        <w:rPr>
-          <w:rFonts w:ascii="Times New Roman" w:hAnsi="Times New Roman"/>
-          <w:sz w:val="26"/>
-          <w:szCs w:val="26"/>
-        </w:rPr>
-        <w:t xml:space="preserve"> в него следующий текст: (рис.3.2.)</w:t>
+        <w:t>и ввела в него следующий текст: (рис.3.2.)</w:t>
       </w:r>
     </w:p>
     <w:p>
@@ -3781,13 +3709,8 @@
         </w:rPr>
       </w:pPr>
       <w:r>
-        <w:rPr>
-          <w:rFonts w:ascii="Times New Roman" w:hAnsi="Times New Roman"/>
-          <w:sz w:val="26"/>
-          <w:szCs w:val="26"/>
-        </w:rPr>
         <w:drawing>
-          <wp:anchor behindDoc="0" distT="0" distB="0" distL="0" distR="0" simplePos="0" locked="0" layoutInCell="0" allowOverlap="1" relativeHeight="37">
+          <wp:anchor behindDoc="0" distT="0" distB="0" distL="0" distR="0" simplePos="0" locked="0" layoutInCell="0" allowOverlap="1" relativeHeight="27">
             <wp:simplePos x="0" y="0"/>
             <wp:positionH relativeFrom="column">
               <wp:align>center</wp:align>
@@ -3980,23 +3903,7 @@
           <w:szCs w:val="26"/>
         </w:rPr>
         <w:tab/>
-        <w:t>-С помощью команды ls проверил</w:t>
-      </w:r>
-      <w:r>
-        <w:rPr>
-          <w:rFonts w:ascii="Times New Roman" w:hAnsi="Times New Roman"/>
-          <w:sz w:val="26"/>
-          <w:szCs w:val="26"/>
-        </w:rPr>
-        <w:t>а</w:t>
-      </w:r>
-      <w:r>
-        <w:rPr>
-          <w:rFonts w:ascii="Times New Roman" w:hAnsi="Times New Roman"/>
-          <w:sz w:val="26"/>
-          <w:szCs w:val="26"/>
-        </w:rPr>
-        <w:t>, что объектный файл был создан. И файл назван «hello.o» (рис.3.3.)</w:t>
+        <w:t>-С помощью команды ls проверила, что объектный файл был создан. И файл назван «hello.o» (рис.3.3.)</w:t>
       </w:r>
     </w:p>
     <w:p>
@@ -4055,7 +3962,7 @@
           <w:rFonts w:ascii="Times New Roman" w:hAnsi="Times New Roman"/>
         </w:rPr>
         <w:drawing>
-          <wp:anchor behindDoc="0" distT="0" distB="0" distL="0" distR="0" simplePos="0" locked="0" layoutInCell="0" allowOverlap="1" relativeHeight="38">
+          <wp:anchor behindDoc="0" distT="0" distB="0" distL="0" distR="0" simplePos="0" locked="0" layoutInCell="0" allowOverlap="1" relativeHeight="28">
             <wp:simplePos x="0" y="0"/>
             <wp:positionH relativeFrom="column">
               <wp:align>center</wp:align>
@@ -4124,23 +4031,7 @@
           <w:sz w:val="26"/>
           <w:szCs w:val="26"/>
         </w:rPr>
-        <w:t xml:space="preserve">-NASM не запускают без параметров. Ключ -f указывает транслятору, что требуется создать бинарные файлы в формате ELF. Следует отметить, что формат elf64 позволяет создавать исполняемый код, работающий под 64-битными версиями Linux. Для 32-битных версий ОС </w:t>
-      </w:r>
-      <w:r>
-        <w:rPr>
-          <w:rFonts w:ascii="Times New Roman" w:hAnsi="Times New Roman"/>
-          <w:sz w:val="26"/>
-          <w:szCs w:val="26"/>
-        </w:rPr>
-        <w:t>н</w:t>
-      </w:r>
-      <w:r>
-        <w:rPr>
-          <w:rFonts w:ascii="Times New Roman" w:hAnsi="Times New Roman"/>
-          <w:sz w:val="26"/>
-          <w:szCs w:val="26"/>
-        </w:rPr>
-        <w:t>азываем в качестве формата просто elf.</w:t>
+        <w:t>-NASM не запускают без параметров. Ключ -f указывает транслятору, что требуется создать бинарные файлы в формате ELF. Следует отметить, что формат elf64 позволяет создавать исполняемый код, работающий под 64-битными версиями Linux. Для 32-битных версий ОС называем в качестве формата просто elf.</w:t>
       </w:r>
     </w:p>
     <w:p>
@@ -4268,7 +4159,9 @@
                               </w:rPr>
                             </w:pPr>
                             <w:r>
-                              <w:rPr/>
+                              <w:rPr>
+                                <w:color w:val="000000"/>
+                              </w:rPr>
                               <w:drawing>
                                 <wp:inline distT="0" distB="0" distL="0" distR="0">
                                   <wp:extent cx="5219700" cy="419100"/>
@@ -4311,6 +4204,7 @@
                             <w:r>
                               <w:rPr>
                                 <w:rFonts w:ascii="Times New Roman" w:hAnsi="Times New Roman"/>
+                                <w:color w:val="000000"/>
                                 <w:sz w:val="26"/>
                                 <w:szCs w:val="26"/>
                               </w:rPr>
@@ -4330,7 +4224,7 @@
           </mc:Choice>
           <mc:Fallback>
             <w:pict>
-              <v:rect id="shape_0" ID="Врезка7" path="m0,0l-2147483645,0l-2147483645,-2147483646l0,-2147483646xe" stroked="f" o:allowincell="f" style="position:absolute;margin-left:17.75pt;margin-top:0pt;width:432.15pt;height:56.6pt;mso-wrap-style:none;v-text-anchor:top;mso-position-horizontal:center;mso-position-vertical:top" wp14:anchorId="527203D9">
+              <v:rect id="shape_0" ID="Врезка7" path="m0,0l-2147483645,0l-2147483645,-2147483646l0,-2147483646xe" stroked="f" o:allowincell="f" style="position:absolute;margin-left:17.75pt;margin-top:0.05pt;width:432.15pt;height:56.6pt;mso-wrap-style:square;v-text-anchor:top;mso-position-horizontal:center" wp14:anchorId="527203D9">
                 <v:fill o:detectmouseclick="t" on="false"/>
                 <v:stroke color="#3465a4" joinstyle="round" endcap="flat"/>
                 <v:textbox>
@@ -4346,7 +4240,9 @@
                         </w:rPr>
                       </w:pPr>
                       <w:r>
-                        <w:rPr/>
+                        <w:rPr>
+                          <w:color w:val="000000"/>
+                        </w:rPr>
                         <w:drawing>
                           <wp:inline distT="0" distB="0" distL="0" distR="0">
                             <wp:extent cx="5219700" cy="419100"/>
@@ -4389,6 +4285,7 @@
                       <w:r>
                         <w:rPr>
                           <w:rFonts w:ascii="Times New Roman" w:hAnsi="Times New Roman"/>
+                          <w:color w:val="000000"/>
                           <w:sz w:val="26"/>
                           <w:szCs w:val="26"/>
                         </w:rPr>
@@ -4415,23 +4312,7 @@
           <w:sz w:val="26"/>
           <w:szCs w:val="26"/>
         </w:rPr>
-        <w:t>-Выполни</w:t>
-      </w:r>
-      <w:r>
-        <w:rPr>
-          <w:rFonts w:ascii="Times New Roman" w:hAnsi="Times New Roman"/>
-          <w:sz w:val="26"/>
-          <w:szCs w:val="26"/>
-        </w:rPr>
-        <w:t>м</w:t>
-      </w:r>
-      <w:r>
-        <w:rPr>
-          <w:rFonts w:ascii="Times New Roman" w:hAnsi="Times New Roman"/>
-          <w:sz w:val="26"/>
-          <w:szCs w:val="26"/>
-        </w:rPr>
-        <w:t xml:space="preserve"> следующую команду: (рис.3.5.)</w:t>
+        <w:t>-Выполним следующую команду: (рис.3.5.)</w:t>
       </w:r>
     </w:p>
     <w:p>
@@ -4465,7 +4346,7 @@
       </w:pPr>
       <w:r>
         <w:drawing>
-          <wp:anchor behindDoc="0" distT="0" distB="0" distL="0" distR="0" simplePos="0" locked="0" layoutInCell="0" allowOverlap="1" relativeHeight="39">
+          <wp:anchor behindDoc="0" distT="0" distB="0" distL="0" distR="0" simplePos="0" locked="0" layoutInCell="0" allowOverlap="1" relativeHeight="29">
             <wp:simplePos x="0" y="0"/>
             <wp:positionH relativeFrom="column">
               <wp:align>center</wp:align>
@@ -4559,23 +4440,7 @@
           <w:szCs w:val="26"/>
         </w:rPr>
         <w:tab/>
-        <w:t>-С помощью команды ls проверил</w:t>
-      </w:r>
-      <w:r>
-        <w:rPr>
-          <w:rFonts w:ascii="Times New Roman" w:hAnsi="Times New Roman"/>
-          <w:sz w:val="26"/>
-          <w:szCs w:val="26"/>
-        </w:rPr>
-        <w:t>а</w:t>
-      </w:r>
-      <w:r>
-        <w:rPr>
-          <w:rFonts w:ascii="Times New Roman" w:hAnsi="Times New Roman"/>
-          <w:sz w:val="26"/>
-          <w:szCs w:val="26"/>
-        </w:rPr>
-        <w:t>, что файлы были созданы. (рис.3.6.)</w:t>
+        <w:t>-С помощью команды ls проверила, что файлы были созданы. (рис.3.6.)</w:t>
       </w:r>
     </w:p>
     <w:p>
@@ -4644,7 +4509,7 @@
           <w:rFonts w:ascii="Times New Roman" w:hAnsi="Times New Roman"/>
         </w:rPr>
         <w:drawing>
-          <wp:anchor behindDoc="0" distT="0" distB="0" distL="0" distR="0" simplePos="0" locked="0" layoutInCell="0" allowOverlap="1" relativeHeight="40">
+          <wp:anchor behindDoc="0" distT="0" distB="0" distL="0" distR="0" simplePos="0" locked="0" layoutInCell="0" allowOverlap="1" relativeHeight="30">
             <wp:simplePos x="0" y="0"/>
             <wp:positionH relativeFrom="column">
               <wp:align>center</wp:align>
@@ -4781,7 +4646,7 @@
     </w:p>
     <w:p>
       <w:pPr>
-        <w:pStyle w:val="Style16"/>
+        <w:pStyle w:val="user4"/>
         <w:spacing w:lineRule="auto" w:line="360"/>
         <w:rPr>
           <w:rFonts w:ascii="Times New Roman" w:hAnsi="Times New Roman"/>
@@ -4814,7 +4679,7 @@
       </w:r>
       <w:r>
         <w:drawing>
-          <wp:anchor behindDoc="0" distT="0" distB="0" distL="0" distR="0" simplePos="0" locked="0" layoutInCell="0" allowOverlap="1" relativeHeight="41">
+          <wp:anchor behindDoc="0" distT="0" distB="0" distL="0" distR="0" simplePos="0" locked="0" layoutInCell="0" allowOverlap="1" relativeHeight="31">
             <wp:simplePos x="0" y="0"/>
             <wp:positionH relativeFrom="column">
               <wp:align>center</wp:align>
@@ -4904,7 +4769,7 @@
           <w:rFonts w:ascii="Times New Roman" w:hAnsi="Times New Roman"/>
         </w:rPr>
         <w:drawing>
-          <wp:anchor behindDoc="0" distT="0" distB="0" distL="0" distR="0" simplePos="0" locked="0" layoutInCell="0" allowOverlap="1" relativeHeight="42">
+          <wp:anchor behindDoc="0" distT="0" distB="0" distL="0" distR="0" simplePos="0" locked="0" layoutInCell="0" allowOverlap="1" relativeHeight="32">
             <wp:simplePos x="0" y="0"/>
             <wp:positionH relativeFrom="column">
               <wp:align>center</wp:align>
@@ -5105,23 +4970,7 @@
           <w:szCs w:val="26"/>
         </w:rPr>
         <w:tab/>
-        <w:t>-Выполнил</w:t>
-      </w:r>
-      <w:r>
-        <w:rPr>
-          <w:rFonts w:ascii="Times New Roman" w:hAnsi="Times New Roman"/>
-          <w:sz w:val="26"/>
-          <w:szCs w:val="26"/>
-        </w:rPr>
-        <w:t xml:space="preserve">а </w:t>
-      </w:r>
-      <w:r>
-        <w:rPr>
-          <w:rFonts w:ascii="Times New Roman" w:hAnsi="Times New Roman"/>
-          <w:sz w:val="26"/>
-          <w:szCs w:val="26"/>
-        </w:rPr>
-        <w:t>следующую команду: (рис.3.9.)</w:t>
+        <w:t>-Выполнила следующую команду: (рис.3.9.)</w:t>
       </w:r>
     </w:p>
     <w:p>
@@ -5220,7 +5069,7 @@
                 <wp:positionV relativeFrom="paragraph">
                   <wp:posOffset>635</wp:posOffset>
                 </wp:positionV>
-                <wp:extent cx="6120130" cy="3188335"/>
+                <wp:extent cx="6120130" cy="3222625"/>
                 <wp:effectExtent l="0" t="635" r="0" b="0"/>
                 <wp:wrapSquare wrapText="bothSides"/>
                 <wp:docPr id="12" name="Врезка11"/>
@@ -5231,7 +5080,7 @@
                       <wps:spPr>
                         <a:xfrm>
                           <a:off x="0" y="0"/>
-                          <a:ext cx="6120000" cy="3188160"/>
+                          <a:ext cx="6120000" cy="3222720"/>
                         </a:xfrm>
                         <a:prstGeom prst="rect">
                           <a:avLst/>
@@ -5260,7 +5109,9 @@
                               </w:rPr>
                             </w:pPr>
                             <w:r>
-                              <w:rPr/>
+                              <w:rPr>
+                                <w:color w:val="000000"/>
+                              </w:rPr>
                               <w:drawing>
                                 <wp:inline distT="0" distB="0" distL="0" distR="0">
                                   <wp:extent cx="5940425" cy="2922270"/>
@@ -5303,6 +5154,7 @@
                             <w:r>
                               <w:rPr>
                                 <w:rFonts w:ascii="Times New Roman" w:hAnsi="Times New Roman"/>
+                                <w:color w:val="000000"/>
                                 <w:sz w:val="26"/>
                                 <w:szCs w:val="26"/>
                               </w:rPr>
@@ -5322,7 +5174,7 @@
           </mc:Choice>
           <mc:Fallback>
             <w:pict>
-              <v:rect id="shape_0" ID="Врезка11" path="m0,0l-2147483645,0l-2147483645,-2147483646l0,-2147483646xe" stroked="f" o:allowincell="f" style="position:absolute;margin-left:-7.1pt;margin-top:0pt;width:481.85pt;height:251pt;mso-wrap-style:none;v-text-anchor:top;mso-position-horizontal:center;mso-position-vertical:top" wp14:anchorId="031EC7FE">
+              <v:rect id="shape_0" ID="Врезка11" path="m0,0l-2147483645,0l-2147483645,-2147483646l0,-2147483646xe" stroked="f" o:allowincell="f" style="position:absolute;margin-left:-7.1pt;margin-top:0.05pt;width:481.85pt;height:253.7pt;mso-wrap-style:square;v-text-anchor:top;mso-position-horizontal:center" wp14:anchorId="031EC7FE">
                 <v:fill o:detectmouseclick="t" on="false"/>
                 <v:stroke color="#3465a4" joinstyle="round" endcap="flat"/>
                 <v:textbox>
@@ -5338,7 +5190,9 @@
                         </w:rPr>
                       </w:pPr>
                       <w:r>
-                        <w:rPr/>
+                        <w:rPr>
+                          <w:color w:val="000000"/>
+                        </w:rPr>
                         <w:drawing>
                           <wp:inline distT="0" distB="0" distL="0" distR="0">
                             <wp:extent cx="5940425" cy="2922270"/>
@@ -5381,6 +5235,7 @@
                       <w:r>
                         <w:rPr>
                           <w:rFonts w:ascii="Times New Roman" w:hAnsi="Times New Roman"/>
+                          <w:color w:val="000000"/>
                           <w:sz w:val="26"/>
                           <w:szCs w:val="26"/>
                         </w:rPr>
@@ -5476,7 +5331,9 @@
                               </w:rPr>
                             </w:pPr>
                             <w:r>
-                              <w:rPr/>
+                              <w:rPr>
+                                <w:color w:val="000000"/>
+                              </w:rPr>
                               <w:drawing>
                                 <wp:inline distT="0" distB="0" distL="0" distR="0">
                                   <wp:extent cx="5940425" cy="2908935"/>
@@ -5519,6 +5376,7 @@
                             <w:r>
                               <w:rPr>
                                 <w:rFonts w:ascii="Times New Roman" w:hAnsi="Times New Roman"/>
+                                <w:color w:val="000000"/>
                                 <w:sz w:val="26"/>
                                 <w:szCs w:val="26"/>
                               </w:rPr>
@@ -5538,7 +5396,7 @@
           </mc:Choice>
           <mc:Fallback>
             <w:pict>
-              <v:rect id="shape_0" ID="Врезка12" path="m0,0l-2147483645,0l-2147483645,-2147483646l0,-2147483646xe" stroked="f" o:allowincell="f" style="position:absolute;margin-left:-7.1pt;margin-top:0pt;width:481.85pt;height:252.65pt;mso-wrap-style:none;v-text-anchor:top;mso-position-horizontal:center;mso-position-vertical:top" wp14:anchorId="2A3A3215">
+              <v:rect id="shape_0" ID="Врезка12" path="m0,0l-2147483645,0l-2147483645,-2147483646l0,-2147483646xe" stroked="f" o:allowincell="f" style="position:absolute;margin-left:-7.1pt;margin-top:0.05pt;width:481.85pt;height:252.65pt;mso-wrap-style:square;v-text-anchor:top;mso-position-horizontal:center" wp14:anchorId="2A3A3215">
                 <v:fill o:detectmouseclick="t" on="false"/>
                 <v:stroke color="#3465a4" joinstyle="round" endcap="flat"/>
                 <v:textbox>
@@ -5554,7 +5412,9 @@
                         </w:rPr>
                       </w:pPr>
                       <w:r>
-                        <w:rPr/>
+                        <w:rPr>
+                          <w:color w:val="000000"/>
+                        </w:rPr>
                         <w:drawing>
                           <wp:inline distT="0" distB="0" distL="0" distR="0">
                             <wp:extent cx="5940425" cy="2908935"/>
@@ -5597,6 +5457,7 @@
                       <w:r>
                         <w:rPr>
                           <w:rFonts w:ascii="Times New Roman" w:hAnsi="Times New Roman"/>
+                          <w:color w:val="000000"/>
                           <w:sz w:val="26"/>
                           <w:szCs w:val="26"/>
                         </w:rPr>
@@ -5682,23 +5543,7 @@
           <w:sz w:val="26"/>
           <w:szCs w:val="26"/>
         </w:rPr>
-        <w:t>-Запустил</w:t>
-      </w:r>
-      <w:r>
-        <w:rPr>
-          <w:rFonts w:ascii="Times New Roman" w:hAnsi="Times New Roman"/>
-          <w:sz w:val="26"/>
-          <w:szCs w:val="26"/>
-        </w:rPr>
-        <w:t>а</w:t>
-      </w:r>
-      <w:r>
-        <w:rPr>
-          <w:rFonts w:ascii="Times New Roman" w:hAnsi="Times New Roman"/>
-          <w:sz w:val="26"/>
-          <w:szCs w:val="26"/>
-        </w:rPr>
-        <w:t xml:space="preserve"> на выполнение созданный исполняемый файл, находящийся в текущем каталоге, набрав в командной строке: (рис.3.11.)</w:t>
+        <w:t>-Запустила на выполнение созданный исполняемый файл, находящийся в текущем каталоге, набрав в командной строке: (рис.3.11.)</w:t>
       </w:r>
     </w:p>
     <w:p>
@@ -5804,7 +5649,9 @@
                               </w:rPr>
                             </w:pPr>
                             <w:r>
-                              <w:rPr/>
+                              <w:rPr>
+                                <w:color w:val="000000"/>
+                              </w:rPr>
                               <w:drawing>
                                 <wp:inline distT="0" distB="0" distL="0" distR="0">
                                   <wp:extent cx="5940425" cy="1113155"/>
@@ -5847,6 +5694,7 @@
                             <w:r>
                               <w:rPr>
                                 <w:rFonts w:ascii="Times New Roman" w:hAnsi="Times New Roman"/>
+                                <w:color w:val="000000"/>
                                 <w:sz w:val="26"/>
                                 <w:szCs w:val="26"/>
                               </w:rPr>
@@ -5866,7 +5714,7 @@
           </mc:Choice>
           <mc:Fallback>
             <w:pict>
-              <v:rect id="shape_0" ID="Врезка13" path="m0,0l-2147483645,0l-2147483645,-2147483646l0,-2147483646xe" stroked="f" o:allowincell="f" style="position:absolute;margin-left:-7.1pt;margin-top:0pt;width:481.85pt;height:111.25pt;mso-wrap-style:none;v-text-anchor:top;mso-position-horizontal:center;mso-position-vertical:top" wp14:anchorId="3941B659">
+              <v:rect id="shape_0" ID="Врезка13" path="m0,0l-2147483645,0l-2147483645,-2147483646l0,-2147483646xe" stroked="f" o:allowincell="f" style="position:absolute;margin-left:-7.1pt;margin-top:0.05pt;width:481.85pt;height:111.25pt;mso-wrap-style:square;v-text-anchor:top;mso-position-horizontal:center" wp14:anchorId="3941B659">
                 <v:fill o:detectmouseclick="t" on="false"/>
                 <v:stroke color="#3465a4" joinstyle="round" endcap="flat"/>
                 <v:textbox>
@@ -5882,7 +5730,9 @@
                         </w:rPr>
                       </w:pPr>
                       <w:r>
-                        <w:rPr/>
+                        <w:rPr>
+                          <w:color w:val="000000"/>
+                        </w:rPr>
                         <w:drawing>
                           <wp:inline distT="0" distB="0" distL="0" distR="0">
                             <wp:extent cx="5940425" cy="1113155"/>
@@ -5925,6 +5775,7 @@
                       <w:r>
                         <w:rPr>
                           <w:rFonts w:ascii="Times New Roman" w:hAnsi="Times New Roman"/>
+                          <w:color w:val="000000"/>
                           <w:sz w:val="26"/>
                           <w:szCs w:val="26"/>
                         </w:rPr>
@@ -5982,7 +5833,7 @@
     <w:p>
       <w:pPr>
         <w:pStyle w:val="Heading1"/>
-        <w:spacing w:lineRule="auto" w:line="360"/>
+        <w:spacing w:lineRule="auto" w:line="360" w:before="0" w:after="120"/>
         <w:ind w:left="709"/>
         <w:jc w:val="both"/>
         <w:rPr>
@@ -6020,23 +5871,7 @@
           <w:sz w:val="26"/>
           <w:szCs w:val="26"/>
         </w:rPr>
-        <w:t>-1. В каталоге ~/work/arch-pc/lab04 с помощью команды cp создал</w:t>
-      </w:r>
-      <w:r>
-        <w:rPr>
-          <w:rFonts w:ascii="Times New Roman" w:hAnsi="Times New Roman"/>
-          <w:sz w:val="26"/>
-          <w:szCs w:val="26"/>
-        </w:rPr>
-        <w:t>а</w:t>
-      </w:r>
-      <w:r>
-        <w:rPr>
-          <w:rFonts w:ascii="Times New Roman" w:hAnsi="Times New Roman"/>
-          <w:sz w:val="26"/>
-          <w:szCs w:val="26"/>
-        </w:rPr>
-        <w:t xml:space="preserve"> копию файла hello.asm с именем lab4.asm: (рис.4.1.)</w:t>
+        <w:t>-1. В каталоге ~/work/arch-pc/lab04 с помощью команды cp создала копию файла hello.asm с именем lab4.asm: (рис.4.1.)</w:t>
       </w:r>
     </w:p>
     <w:p>
@@ -6132,7 +5967,9 @@
                               </w:rPr>
                             </w:pPr>
                             <w:r>
-                              <w:rPr/>
+                              <w:rPr>
+                                <w:color w:val="000000"/>
+                              </w:rPr>
                               <w:drawing>
                                 <wp:inline distT="0" distB="0" distL="0" distR="0">
                                   <wp:extent cx="5940425" cy="3161030"/>
@@ -6175,6 +6012,7 @@
                             <w:r>
                               <w:rPr>
                                 <w:rFonts w:ascii="Times New Roman" w:hAnsi="Times New Roman"/>
+                                <w:color w:val="000000"/>
                                 <w:sz w:val="26"/>
                                 <w:szCs w:val="26"/>
                               </w:rPr>
@@ -6194,7 +6032,7 @@
           </mc:Choice>
           <mc:Fallback>
             <w:pict>
-              <v:rect id="shape_0" ID="Врезка14" path="m0,0l-2147483645,0l-2147483645,-2147483646l0,-2147483646xe" stroked="f" o:allowincell="f" style="position:absolute;margin-left:-7.1pt;margin-top:0pt;width:481.85pt;height:272.5pt;mso-wrap-style:none;v-text-anchor:top;mso-position-horizontal:center;mso-position-vertical:top" wp14:anchorId="18706260">
+              <v:rect id="shape_0" ID="Врезка14" path="m0,0l-2147483645,0l-2147483645,-2147483646l0,-2147483646xe" stroked="f" o:allowincell="f" style="position:absolute;margin-left:-7.1pt;margin-top:0.05pt;width:481.85pt;height:272.5pt;mso-wrap-style:square;v-text-anchor:top;mso-position-horizontal:center" wp14:anchorId="18706260">
                 <v:fill o:detectmouseclick="t" on="false"/>
                 <v:stroke color="#3465a4" joinstyle="round" endcap="flat"/>
                 <v:textbox>
@@ -6210,7 +6048,9 @@
                         </w:rPr>
                       </w:pPr>
                       <w:r>
-                        <w:rPr/>
+                        <w:rPr>
+                          <w:color w:val="000000"/>
+                        </w:rPr>
                         <w:drawing>
                           <wp:inline distT="0" distB="0" distL="0" distR="0">
                             <wp:extent cx="5940425" cy="3161030"/>
@@ -6253,6 +6093,7 @@
                       <w:r>
                         <w:rPr>
                           <w:rFonts w:ascii="Times New Roman" w:hAnsi="Times New Roman"/>
+                          <w:color w:val="000000"/>
                           <w:sz w:val="26"/>
                           <w:szCs w:val="26"/>
                         </w:rPr>
@@ -6296,43 +6137,22 @@
           <w:sz w:val="26"/>
           <w:szCs w:val="26"/>
         </w:rPr>
-        <w:t>-2. С помощью текстового редактора внес</w:t>
-      </w:r>
-      <w:r>
-        <w:rPr>
-          <w:rFonts w:ascii="Times New Roman" w:hAnsi="Times New Roman"/>
-          <w:sz w:val="26"/>
-          <w:szCs w:val="26"/>
-        </w:rPr>
-        <w:t>ла</w:t>
-      </w:r>
-      <w:r>
-        <w:rPr>
-          <w:rFonts w:ascii="Times New Roman" w:hAnsi="Times New Roman"/>
-          <w:sz w:val="26"/>
-          <w:szCs w:val="26"/>
-        </w:rPr>
-        <w:t xml:space="preserve"> изменения в текст программы в файле lab4.asm так, чтобы вместо Hello world! на экран выводилась строка с моей фамилией и именем: (рис.4.2.)</w:t>
-      </w:r>
-    </w:p>
-    <w:p>
-      <w:pPr>
-        <w:pStyle w:val="Textbody"/>
-        <w:spacing w:lineRule="auto" w:line="360"/>
-        <w:ind w:left="709"/>
-        <w:jc w:val="both"/>
-        <w:rPr>
-          <w:rFonts w:ascii="Times New Roman" w:hAnsi="Times New Roman"/>
-          <w:sz w:val="26"/>
-          <w:szCs w:val="26"/>
-        </w:rPr>
-      </w:pPr>
-      <w:r>
-        <w:rPr>
-          <w:rFonts w:ascii="Times New Roman" w:hAnsi="Times New Roman"/>
-          <w:sz w:val="26"/>
-          <w:szCs w:val="26"/>
-        </w:rPr>
+        <w:t>-2. С помощью текстового редактора внесла изменения в текст программы в файле lab4.asm так, чтобы вместо Hello world! на экран выводилась строка с моей фамилией и именем: (рис.4.2.)</w:t>
+      </w:r>
+    </w:p>
+    <w:p>
+      <w:pPr>
+        <w:pStyle w:val="Textbody"/>
+        <w:spacing w:lineRule="auto" w:line="360"/>
+        <w:ind w:left="709"/>
+        <w:jc w:val="both"/>
+        <w:rPr>
+          <w:rFonts w:ascii="Times New Roman" w:hAnsi="Times New Roman"/>
+          <w:sz w:val="26"/>
+          <w:szCs w:val="26"/>
+        </w:rPr>
+      </w:pPr>
+      <w:r>
         <mc:AlternateContent>
           <mc:Choice Requires="wps">
             <w:drawing>
@@ -6384,7 +6204,9 @@
                               </w:rPr>
                             </w:pPr>
                             <w:r>
-                              <w:rPr/>
+                              <w:rPr>
+                                <w:color w:val="000000"/>
+                              </w:rPr>
                               <w:drawing>
                                 <wp:inline distT="0" distB="0" distL="0" distR="0">
                                   <wp:extent cx="5940425" cy="2500630"/>
@@ -6427,6 +6249,7 @@
                             <w:r>
                               <w:rPr>
                                 <w:rFonts w:ascii="Times New Roman" w:hAnsi="Times New Roman"/>
+                                <w:color w:val="000000"/>
                                 <w:sz w:val="26"/>
                                 <w:szCs w:val="26"/>
                               </w:rPr>
@@ -6446,7 +6269,7 @@
           </mc:Choice>
           <mc:Fallback>
             <w:pict>
-              <v:rect id="shape_0" ID="Врезка15" path="m0,0l-2147483645,0l-2147483645,-2147483646l0,-2147483646xe" stroked="f" o:allowincell="f" style="position:absolute;margin-left:-4.5pt;margin-top:19.15pt;width:481.85pt;height:220.5pt;mso-wrap-style:none;v-text-anchor:top" wp14:anchorId="41338E34">
+              <v:rect id="shape_0" ID="Врезка15" path="m0,0l-2147483645,0l-2147483645,-2147483646l0,-2147483646xe" stroked="f" o:allowincell="f" style="position:absolute;margin-left:-4.5pt;margin-top:19.15pt;width:481.85pt;height:220.5pt;mso-wrap-style:square;v-text-anchor:top" wp14:anchorId="41338E34">
                 <v:fill o:detectmouseclick="t" on="false"/>
                 <v:stroke color="#3465a4" joinstyle="round" endcap="flat"/>
                 <v:textbox>
@@ -6462,7 +6285,9 @@
                         </w:rPr>
                       </w:pPr>
                       <w:r>
-                        <w:rPr/>
+                        <w:rPr>
+                          <w:color w:val="000000"/>
+                        </w:rPr>
                         <w:drawing>
                           <wp:inline distT="0" distB="0" distL="0" distR="0">
                             <wp:extent cx="5940425" cy="2500630"/>
@@ -6505,6 +6330,7 @@
                       <w:r>
                         <w:rPr>
                           <w:rFonts w:ascii="Times New Roman" w:hAnsi="Times New Roman"/>
+                          <w:color w:val="000000"/>
                           <w:sz w:val="26"/>
                           <w:szCs w:val="26"/>
                         </w:rPr>
@@ -6534,74 +6360,26 @@
     <w:p>
       <w:pPr>
         <w:pStyle w:val="Textbody"/>
-        <w:spacing w:lineRule="auto" w:line="360"/>
-        <w:ind w:left="709"/>
-        <w:jc w:val="both"/>
-        <w:rPr>
-          <w:rFonts w:ascii="Times New Roman" w:hAnsi="Times New Roman"/>
-        </w:rPr>
-      </w:pPr>
-      <w:r>
-        <w:rPr>
-          <w:rFonts w:ascii="Times New Roman" w:hAnsi="Times New Roman"/>
-        </w:rPr>
-        <w:tab/>
-      </w:r>
-      <w:r>
-        <w:rPr>
-          <w:rFonts w:ascii="Times New Roman" w:hAnsi="Times New Roman"/>
-          <w:sz w:val="26"/>
-          <w:szCs w:val="26"/>
-        </w:rPr>
-        <w:t>-3. Оттранслировал</w:t>
-      </w:r>
-      <w:r>
-        <w:rPr>
-          <w:rFonts w:ascii="Times New Roman" w:hAnsi="Times New Roman"/>
-          <w:sz w:val="26"/>
-          <w:szCs w:val="26"/>
-        </w:rPr>
-        <w:t>а</w:t>
-      </w:r>
-      <w:r>
-        <w:rPr>
-          <w:rFonts w:ascii="Times New Roman" w:hAnsi="Times New Roman"/>
-          <w:sz w:val="26"/>
-          <w:szCs w:val="26"/>
-        </w:rPr>
-        <w:t xml:space="preserve"> полученный текст программы lab4.asm в объектный файл. Выполнил</w:t>
-      </w:r>
-      <w:r>
-        <w:rPr>
-          <w:rFonts w:ascii="Times New Roman" w:hAnsi="Times New Roman"/>
-          <w:sz w:val="26"/>
-          <w:szCs w:val="26"/>
-        </w:rPr>
-        <w:t>а</w:t>
-      </w:r>
-      <w:r>
-        <w:rPr>
-          <w:rFonts w:ascii="Times New Roman" w:hAnsi="Times New Roman"/>
-          <w:sz w:val="26"/>
-          <w:szCs w:val="26"/>
-        </w:rPr>
-        <w:t xml:space="preserve"> компоновку объектного файла и запустил</w:t>
-      </w:r>
-      <w:r>
-        <w:rPr>
-          <w:rFonts w:ascii="Times New Roman" w:hAnsi="Times New Roman"/>
-          <w:sz w:val="26"/>
-          <w:szCs w:val="26"/>
-        </w:rPr>
-        <w:t>а</w:t>
-      </w:r>
-      <w:r>
-        <w:rPr>
-          <w:rFonts w:ascii="Times New Roman" w:hAnsi="Times New Roman"/>
-          <w:sz w:val="26"/>
-          <w:szCs w:val="26"/>
-        </w:rPr>
-        <w:t xml:space="preserve"> получившийся исполняемый файл. (рис.4.3.)</w:t>
+        <w:spacing w:lineRule="auto" w:line="360" w:before="0" w:after="140"/>
+        <w:ind w:left="709"/>
+        <w:jc w:val="both"/>
+        <w:rPr>
+          <w:rFonts w:ascii="Times New Roman" w:hAnsi="Times New Roman"/>
+        </w:rPr>
+      </w:pPr>
+      <w:r>
+        <w:rPr>
+          <w:rFonts w:ascii="Times New Roman" w:hAnsi="Times New Roman"/>
+        </w:rPr>
+        <w:tab/>
+      </w:r>
+      <w:r>
+        <w:rPr>
+          <w:rFonts w:ascii="Times New Roman" w:hAnsi="Times New Roman"/>
+          <w:sz w:val="26"/>
+          <w:szCs w:val="26"/>
+        </w:rPr>
+        <w:t>-3. Оттранслировала полученный текст программы lab4.asm в объектный файл. Выполнила компоновку объектного файла и запустила получившийся исполняемый файл. (рис.4.3.)</w:t>
       </w:r>
     </w:p>
     <w:p>
@@ -6770,7 +6548,9 @@
                               </w:rPr>
                             </w:pPr>
                             <w:r>
-                              <w:rPr/>
+                              <w:rPr>
+                                <w:color w:val="000000"/>
+                              </w:rPr>
                               <w:drawing>
                                 <wp:inline distT="0" distB="0" distL="0" distR="0">
                                   <wp:extent cx="5940425" cy="1745615"/>
@@ -6813,6 +6593,7 @@
                             <w:r>
                               <w:rPr>
                                 <w:rFonts w:ascii="Times New Roman" w:hAnsi="Times New Roman"/>
+                                <w:color w:val="000000"/>
                                 <w:sz w:val="26"/>
                                 <w:szCs w:val="26"/>
                               </w:rPr>
@@ -6832,7 +6613,7 @@
           </mc:Choice>
           <mc:Fallback>
             <w:pict>
-              <v:rect id="shape_0" ID="Врезка16" path="m0,0l-2147483645,0l-2147483645,-2147483646l0,-2147483646xe" stroked="f" o:allowincell="f" style="position:absolute;margin-left:-7.1pt;margin-top:0pt;width:481.85pt;height:161.05pt;mso-wrap-style:none;v-text-anchor:top;mso-position-horizontal:center;mso-position-vertical:top" wp14:anchorId="32CA26B4">
+              <v:rect id="shape_0" ID="Врезка16" path="m0,0l-2147483645,0l-2147483645,-2147483646l0,-2147483646xe" stroked="f" o:allowincell="f" style="position:absolute;margin-left:-7.1pt;margin-top:0.05pt;width:481.85pt;height:161.05pt;mso-wrap-style:square;v-text-anchor:top;mso-position-horizontal:center" wp14:anchorId="32CA26B4">
                 <v:fill o:detectmouseclick="t" on="false"/>
                 <v:stroke color="#3465a4" joinstyle="round" endcap="flat"/>
                 <v:textbox>
@@ -6848,7 +6629,9 @@
                         </w:rPr>
                       </w:pPr>
                       <w:r>
-                        <w:rPr/>
+                        <w:rPr>
+                          <w:color w:val="000000"/>
+                        </w:rPr>
                         <w:drawing>
                           <wp:inline distT="0" distB="0" distL="0" distR="0">
                             <wp:extent cx="5940425" cy="1745615"/>
@@ -6891,6 +6674,7 @@
                       <w:r>
                         <w:rPr>
                           <w:rFonts w:ascii="Times New Roman" w:hAnsi="Times New Roman"/>
+                          <w:color w:val="000000"/>
                           <w:sz w:val="26"/>
                           <w:szCs w:val="26"/>
                         </w:rPr>
@@ -6934,61 +6718,29 @@
           <w:sz w:val="26"/>
           <w:szCs w:val="26"/>
         </w:rPr>
-        <w:t>-4. Скопировал</w:t>
-      </w:r>
-      <w:r>
-        <w:rPr>
-          <w:rFonts w:ascii="Times New Roman" w:hAnsi="Times New Roman"/>
-          <w:sz w:val="26"/>
-          <w:szCs w:val="26"/>
-        </w:rPr>
-        <w:t>а</w:t>
-      </w:r>
-      <w:r>
-        <w:rPr>
-          <w:rFonts w:ascii="Times New Roman" w:hAnsi="Times New Roman"/>
-          <w:sz w:val="26"/>
-          <w:szCs w:val="26"/>
-        </w:rPr>
-        <w:t xml:space="preserve"> файлы hello.asm и lab4.asm в свой локальный репозиторий в каталог~/work/study/2025-2026/"Архитектура компьютера"/study_2025-2026_arh-pc/labs/lab04/ (рис.4.4.)</w:t>
-      </w:r>
-    </w:p>
-    <w:p>
-      <w:pPr>
-        <w:pStyle w:val="Textbody"/>
-        <w:spacing w:lineRule="auto" w:line="360"/>
-        <w:ind w:left="709"/>
-        <w:jc w:val="both"/>
-        <w:rPr>
-          <w:rFonts w:ascii="Times New Roman" w:hAnsi="Times New Roman"/>
-          <w:sz w:val="26"/>
-          <w:szCs w:val="26"/>
-        </w:rPr>
-      </w:pPr>
-      <w:r>
-        <w:rPr>
-          <w:rFonts w:ascii="Times New Roman" w:hAnsi="Times New Roman"/>
-          <w:sz w:val="26"/>
-          <w:szCs w:val="26"/>
-        </w:rPr>
-        <w:tab/>
-        <w:t>-Загрузил</w:t>
-      </w:r>
-      <w:r>
-        <w:rPr>
-          <w:rFonts w:ascii="Times New Roman" w:hAnsi="Times New Roman"/>
-          <w:sz w:val="26"/>
-          <w:szCs w:val="26"/>
-        </w:rPr>
-        <w:t>а</w:t>
-      </w:r>
-      <w:r>
-        <w:rPr>
-          <w:rFonts w:ascii="Times New Roman" w:hAnsi="Times New Roman"/>
-          <w:sz w:val="26"/>
-          <w:szCs w:val="26"/>
-        </w:rPr>
-        <w:t xml:space="preserve"> файлы на Github. (рис.4.4.)</w:t>
+        <w:t>-4. Скопировала файлы hello.asm и lab4.asm в свой локальный репозиторий в каталог~/work/study/2025-2026/"Архитектура компьютера"/study_2025-2026_arh-pc/labs/lab04/ (рис.4.4.)</w:t>
+      </w:r>
+    </w:p>
+    <w:p>
+      <w:pPr>
+        <w:pStyle w:val="Textbody"/>
+        <w:spacing w:lineRule="auto" w:line="360"/>
+        <w:ind w:left="709"/>
+        <w:jc w:val="both"/>
+        <w:rPr>
+          <w:rFonts w:ascii="Times New Roman" w:hAnsi="Times New Roman"/>
+          <w:sz w:val="26"/>
+          <w:szCs w:val="26"/>
+        </w:rPr>
+      </w:pPr>
+      <w:r>
+        <w:rPr>
+          <w:rFonts w:ascii="Times New Roman" w:hAnsi="Times New Roman"/>
+          <w:sz w:val="26"/>
+          <w:szCs w:val="26"/>
+        </w:rPr>
+        <w:tab/>
+        <w:t>-Загрузила файлы на Github. (рис.4.4.)</w:t>
       </w:r>
     </w:p>
     <w:p>
@@ -7237,42 +6989,83 @@
           <w:sz w:val="26"/>
           <w:szCs w:val="26"/>
         </w:rPr>
-      </w:r>
-    </w:p>
-    <w:p>
-      <w:pPr>
-        <w:pStyle w:val="Textbody"/>
-        <w:ind w:left="709"/>
-        <w:jc w:val="both"/>
-        <w:rPr>
-          <w:rFonts w:ascii="Times New Roman" w:hAnsi="Times New Roman"/>
-          <w:sz w:val="26"/>
-          <w:szCs w:val="26"/>
-        </w:rPr>
-      </w:pPr>
-      <w:r>
-        <w:rPr>
-          <w:rFonts w:ascii="Times New Roman" w:hAnsi="Times New Roman"/>
-          <w:sz w:val="26"/>
-          <w:szCs w:val="26"/>
-        </w:rPr>
-      </w:r>
-    </w:p>
-    <w:p>
-      <w:pPr>
-        <w:pStyle w:val="Textbody"/>
-        <w:ind w:left="709"/>
-        <w:jc w:val="both"/>
-        <w:rPr>
-          <w:rFonts w:ascii="Times New Roman" w:hAnsi="Times New Roman"/>
-        </w:rPr>
-      </w:pPr>
-      <w:r>
-        <w:rPr>
-          <w:rFonts w:ascii="Times New Roman" w:hAnsi="Times New Roman"/>
-          <w:sz w:val="26"/>
-          <w:szCs w:val="26"/>
-        </w:rPr>
+        <w:drawing>
+          <wp:anchor behindDoc="0" distT="0" distB="0" distL="0" distR="0" simplePos="0" locked="0" layoutInCell="0" allowOverlap="1" relativeHeight="43">
+            <wp:simplePos x="0" y="0"/>
+            <wp:positionH relativeFrom="column">
+              <wp:align>center</wp:align>
+            </wp:positionH>
+            <wp:positionV relativeFrom="paragraph">
+              <wp:posOffset>635</wp:posOffset>
+            </wp:positionV>
+            <wp:extent cx="5490210" cy="1763395"/>
+            <wp:effectExtent l="0" t="0" r="0" b="0"/>
+            <wp:wrapSquare wrapText="largest"/>
+            <wp:docPr id="18" name="Изображение18" descr=""/>
+            <wp:cNvGraphicFramePr>
+              <a:graphicFrameLocks xmlns:a="http://schemas.openxmlformats.org/drawingml/2006/main" noChangeAspect="1"/>
+            </wp:cNvGraphicFramePr>
+            <a:graphic xmlns:a="http://schemas.openxmlformats.org/drawingml/2006/main">
+              <a:graphicData uri="http://schemas.openxmlformats.org/drawingml/2006/picture">
+                <pic:pic xmlns:pic="http://schemas.openxmlformats.org/drawingml/2006/picture">
+                  <pic:nvPicPr>
+                    <pic:cNvPr id="18" name="Изображение18" descr=""/>
+                    <pic:cNvPicPr>
+                      <a:picLocks noChangeAspect="1" noChangeArrowheads="1"/>
+                    </pic:cNvPicPr>
+                  </pic:nvPicPr>
+                  <pic:blipFill>
+                    <a:blip r:embed="rId32"/>
+                    <a:stretch>
+                      <a:fillRect/>
+                    </a:stretch>
+                  </pic:blipFill>
+                  <pic:spPr bwMode="auto">
+                    <a:xfrm>
+                      <a:off x="0" y="0"/>
+                      <a:ext cx="5490210" cy="1763395"/>
+                    </a:xfrm>
+                    <a:prstGeom prst="rect">
+                      <a:avLst/>
+                    </a:prstGeom>
+                    <a:noFill/>
+                  </pic:spPr>
+                </pic:pic>
+              </a:graphicData>
+            </a:graphic>
+          </wp:anchor>
+        </w:drawing>
+      </w:r>
+    </w:p>
+    <w:p>
+      <w:pPr>
+        <w:pStyle w:val="Textbody"/>
+        <w:ind w:left="709"/>
+        <w:jc w:val="both"/>
+        <w:rPr>
+          <w:rFonts w:ascii="Times New Roman" w:hAnsi="Times New Roman"/>
+          <w:sz w:val="26"/>
+          <w:szCs w:val="26"/>
+        </w:rPr>
+      </w:pPr>
+      <w:r>
+        <w:rPr>
+          <w:rFonts w:ascii="Times New Roman" w:hAnsi="Times New Roman"/>
+          <w:sz w:val="26"/>
+          <w:szCs w:val="26"/>
+        </w:rPr>
+      </w:r>
+    </w:p>
+    <w:p>
+      <w:pPr>
+        <w:pStyle w:val="Textbody"/>
+        <w:ind w:left="709"/>
+        <w:jc w:val="both"/>
+        <w:rPr>
+          <w:rFonts w:ascii="Times New Roman" w:hAnsi="Times New Roman"/>
+        </w:rPr>
+      </w:pPr>
+      <w:r>
         <mc:AlternateContent>
           <mc:Choice Requires="wps">
             <w:drawing>
@@ -7287,7 +7080,7 @@
                 <wp:extent cx="6120130" cy="644525"/>
                 <wp:effectExtent l="0" t="635" r="0" b="0"/>
                 <wp:wrapSquare wrapText="bothSides"/>
-                <wp:docPr id="18" name="Врезка17"/>
+                <wp:docPr id="19" name="Врезка17"/>
                 <a:graphic xmlns:a="http://schemas.openxmlformats.org/drawingml/2006/main">
                   <a:graphicData uri="http://schemas.microsoft.com/office/word/2010/wordprocessingShape">
                     <wps:wsp>
@@ -7326,26 +7119,11 @@
                             <w:r>
                               <w:rPr>
                                 <w:rFonts w:ascii="Times New Roman" w:hAnsi="Times New Roman"/>
+                                <w:color w:val="000000"/>
                                 <w:sz w:val="26"/>
                                 <w:szCs w:val="26"/>
                               </w:rPr>
-                              <w:t>4.4. Скопировал</w:t>
-                            </w:r>
-                            <w:r>
-                              <w:rPr>
-                                <w:rFonts w:ascii="Times New Roman" w:hAnsi="Times New Roman"/>
-                                <w:sz w:val="26"/>
-                                <w:szCs w:val="26"/>
-                              </w:rPr>
-                              <w:t>а</w:t>
-                            </w:r>
-                            <w:r>
-                              <w:rPr>
-                                <w:rFonts w:ascii="Times New Roman" w:hAnsi="Times New Roman"/>
-                                <w:sz w:val="26"/>
-                                <w:szCs w:val="26"/>
-                              </w:rPr>
-                              <w:t xml:space="preserve"> файлы hello.asm и lab4.asm в свой локальный репозиторий в каталог~/work/study/2025-2026/"АрхитектураСкопировал файлы hello.asm и lab4.asm в свой локальный репозиторий в каталог~/work/study/2025-2026/"Архитектура</w:t>
+                              <w:t>4.4. Скопировала файлы hello.asm и lab4.asm в свой локальный репозиторий в каталог~/work/study/2025-2026/"АрхитектураСкопировал файлы hello.asm и lab4.asm в свой локальный репозиторий в каталог~/work/study/2025-2026/"Архитектура</w:t>
                             </w:r>
                           </w:p>
                         </w:txbxContent>
@@ -7361,7 +7139,7 @@
           </mc:Choice>
           <mc:Fallback>
             <w:pict>
-              <v:rect id="shape_0" ID="Врезка17" path="m0,0l-2147483645,0l-2147483645,-2147483646l0,-2147483646xe" stroked="f" o:allowincell="f" style="position:absolute;margin-left:0pt;margin-top:-5.65pt;width:481.85pt;height:50.7pt;mso-wrap-style:none;v-text-anchor:top" wp14:anchorId="5B90DB80">
+              <v:rect id="shape_0" ID="Врезка17" path="m0,0l-2147483645,0l-2147483645,-2147483646l0,-2147483646xe" stroked="f" o:allowincell="f" style="position:absolute;margin-left:0pt;margin-top:-5.65pt;width:481.85pt;height:50.7pt;mso-wrap-style:square;v-text-anchor:top" wp14:anchorId="5B90DB80">
                 <v:fill o:detectmouseclick="t" on="false"/>
                 <v:stroke color="#3465a4" joinstyle="round" endcap="flat"/>
                 <v:textbox>
@@ -7379,26 +7157,11 @@
                       <w:r>
                         <w:rPr>
                           <w:rFonts w:ascii="Times New Roman" w:hAnsi="Times New Roman"/>
+                          <w:color w:val="000000"/>
                           <w:sz w:val="26"/>
                           <w:szCs w:val="26"/>
                         </w:rPr>
-                        <w:t>4.4. Скопировал</w:t>
-                      </w:r>
-                      <w:r>
-                        <w:rPr>
-                          <w:rFonts w:ascii="Times New Roman" w:hAnsi="Times New Roman"/>
-                          <w:sz w:val="26"/>
-                          <w:szCs w:val="26"/>
-                        </w:rPr>
-                        <w:t>а</w:t>
-                      </w:r>
-                      <w:r>
-                        <w:rPr>
-                          <w:rFonts w:ascii="Times New Roman" w:hAnsi="Times New Roman"/>
-                          <w:sz w:val="26"/>
-                          <w:szCs w:val="26"/>
-                        </w:rPr>
-                        <w:t xml:space="preserve"> файлы hello.asm и lab4.asm в свой локальный репозиторий в каталог~/work/study/2025-2026/"АрхитектураСкопировал файлы hello.asm и lab4.asm в свой локальный репозиторий в каталог~/work/study/2025-2026/"Архитектура</w:t>
+                        <w:t>4.4. Скопировала файлы hello.asm и lab4.asm в свой локальный репозиторий в каталог~/work/study/2025-2026/"АрхитектураСкопировал файлы hello.asm и lab4.asm в свой локальный репозиторий в каталог~/work/study/2025-2026/"Архитектура</w:t>
                       </w:r>
                     </w:p>
                   </w:txbxContent>
@@ -7419,10 +7182,10 @@
                 <wp:positionV relativeFrom="paragraph">
                   <wp:posOffset>3529330</wp:posOffset>
                 </wp:positionV>
-                <wp:extent cx="6120130" cy="455930"/>
+                <wp:extent cx="6120130" cy="454660"/>
                 <wp:effectExtent l="0" t="0" r="0" b="0"/>
                 <wp:wrapSquare wrapText="bothSides"/>
-                <wp:docPr id="19" name="Врезка18"/>
+                <wp:docPr id="20" name="Врезка18"/>
                 <a:graphic xmlns:a="http://schemas.openxmlformats.org/drawingml/2006/main">
                   <a:graphicData uri="http://schemas.microsoft.com/office/word/2010/wordprocessingShape">
                     <wps:wsp>
@@ -7430,7 +7193,7 @@
                       <wps:spPr>
                         <a:xfrm>
                           <a:off x="0" y="0"/>
-                          <a:ext cx="6120000" cy="455760"/>
+                          <a:ext cx="6120000" cy="454680"/>
                         </a:xfrm>
                         <a:prstGeom prst="rect">
                           <a:avLst/>
@@ -7450,7 +7213,7 @@
                         <w:txbxContent>
                           <w:p>
                             <w:pPr>
-                              <w:pStyle w:val="Style16"/>
+                              <w:pStyle w:val="user4"/>
                               <w:spacing w:before="120" w:after="120"/>
                               <w:rPr>
                                 <w:rFonts w:ascii="Times New Roman" w:hAnsi="Times New Roman"/>
@@ -7461,26 +7224,11 @@
                             <w:r>
                               <w:rPr>
                                 <w:rFonts w:ascii="Times New Roman" w:hAnsi="Times New Roman"/>
+                                <w:color w:val="000000"/>
                                 <w:sz w:val="26"/>
                                 <w:szCs w:val="26"/>
                               </w:rPr>
-                              <w:t>4.4. Скопировал</w:t>
-                            </w:r>
-                            <w:r>
-                              <w:rPr>
-                                <w:rFonts w:ascii="Times New Roman" w:hAnsi="Times New Roman"/>
-                                <w:sz w:val="26"/>
-                                <w:szCs w:val="26"/>
-                              </w:rPr>
-                              <w:t>а</w:t>
-                            </w:r>
-                            <w:r>
-                              <w:rPr>
-                                <w:rFonts w:ascii="Times New Roman" w:hAnsi="Times New Roman"/>
-                                <w:sz w:val="26"/>
-                                <w:szCs w:val="26"/>
-                              </w:rPr>
-                              <w:t xml:space="preserve"> файлы hello.asm и lab4.asm в свой локальный репозиторий в каталог~/work/study/2025-2026/"Архитектура</w:t>
+                              <w:t>4.4. Скопировала файлы hello.asm и lab4.asm в свой локальный репозиторий в каталог~/work/study/2025-2026/"Архитектура</w:t>
                             </w:r>
                           </w:p>
                         </w:txbxContent>
@@ -7496,14 +7244,14 @@
           </mc:Choice>
           <mc:Fallback>
             <w:pict>
-              <v:rect id="shape_0" ID="Врезка18" path="m0,0l-2147483645,0l-2147483645,-2147483646l0,-2147483646xe" stroked="f" o:allowincell="f" style="position:absolute;margin-left:0pt;margin-top:277.9pt;width:481.85pt;height:35.85pt;mso-wrap-style:none;v-text-anchor:top" wp14:anchorId="73602A60">
+              <v:rect id="shape_0" ID="Врезка18" path="m0,0l-2147483645,0l-2147483645,-2147483646l0,-2147483646xe" stroked="f" o:allowincell="f" style="position:absolute;margin-left:0pt;margin-top:277.9pt;width:481.85pt;height:35.75pt;mso-wrap-style:square;v-text-anchor:top" wp14:anchorId="73602A60">
                 <v:fill o:detectmouseclick="t" on="false"/>
                 <v:stroke color="#3465a4" joinstyle="round" endcap="flat"/>
                 <v:textbox>
                   <w:txbxContent>
                     <w:p>
                       <w:pPr>
-                        <w:pStyle w:val="Style16"/>
+                        <w:pStyle w:val="user4"/>
                         <w:spacing w:before="120" w:after="120"/>
                         <w:rPr>
                           <w:rFonts w:ascii="Times New Roman" w:hAnsi="Times New Roman"/>
@@ -7514,26 +7262,11 @@
                       <w:r>
                         <w:rPr>
                           <w:rFonts w:ascii="Times New Roman" w:hAnsi="Times New Roman"/>
+                          <w:color w:val="000000"/>
                           <w:sz w:val="26"/>
                           <w:szCs w:val="26"/>
                         </w:rPr>
-                        <w:t>4.4. Скопировал</w:t>
-                      </w:r>
-                      <w:r>
-                        <w:rPr>
-                          <w:rFonts w:ascii="Times New Roman" w:hAnsi="Times New Roman"/>
-                          <w:sz w:val="26"/>
-                          <w:szCs w:val="26"/>
-                        </w:rPr>
-                        <w:t>а</w:t>
-                      </w:r>
-                      <w:r>
-                        <w:rPr>
-                          <w:rFonts w:ascii="Times New Roman" w:hAnsi="Times New Roman"/>
-                          <w:sz w:val="26"/>
-                          <w:szCs w:val="26"/>
-                        </w:rPr>
-                        <w:t xml:space="preserve"> файлы hello.asm и lab4.asm в свой локальный репозиторий в каталог~/work/study/2025-2026/"Архитектура</w:t>
+                        <w:t>4.4. Скопировала файлы hello.asm и lab4.asm в свой локальный репозиторий в каталог~/work/study/2025-2026/"Архитектура</w:t>
                       </w:r>
                     </w:p>
                   </w:txbxContent>
@@ -7601,25 +7334,13 @@
           <w:rFonts w:ascii="Times New Roman" w:hAnsi="Times New Roman"/>
         </w:rPr>
         <w:tab/>
-        <w:t xml:space="preserve">-В результате лабораторной работы </w:t>
-      </w:r>
-      <w:r>
-        <w:rPr>
-          <w:rFonts w:ascii="Times New Roman" w:hAnsi="Times New Roman"/>
-        </w:rPr>
-        <w:t xml:space="preserve">мной </w:t>
-      </w:r>
-      <w:r>
-        <w:rPr>
-          <w:rFonts w:ascii="Times New Roman" w:hAnsi="Times New Roman"/>
-        </w:rPr>
-        <w:t>были освоены процедуры компиляции и сборки программ, написанных на ассемблере NASM.</w:t>
+        <w:t>-В результате лабораторной работы мной были освоены процедуры компиляции и сборки программ, написанных на ассемблере NASM.</w:t>
       </w:r>
     </w:p>
     <w:sectPr>
-      <w:footerReference w:type="even" r:id="rId32"/>
-      <w:footerReference w:type="default" r:id="rId33"/>
-      <w:footerReference w:type="first" r:id="rId34"/>
+      <w:footerReference w:type="even" r:id="rId33"/>
+      <w:footerReference w:type="default" r:id="rId34"/>
+      <w:footerReference w:type="first" r:id="rId35"/>
       <w:type w:val="nextPage"/>
       <w:pgSz w:w="11906" w:h="16838"/>
       <w:pgMar w:left="1701" w:right="850" w:gutter="0" w:header="0" w:top="1134" w:footer="720" w:bottom="1134"/>
@@ -7670,7 +7391,7 @@
     </w:r>
     <w:r>
       <w:rPr/>
-      <w:t>23</w:t>
+      <w:t>22</w:t>
     </w:r>
     <w:r>
       <w:rPr/>
@@ -7705,7 +7426,7 @@
     </w:r>
     <w:r>
       <w:rPr/>
-      <w:t>23</w:t>
+      <w:t>22</w:t>
     </w:r>
     <w:r>
       <w:rPr/>
@@ -8134,7 +7855,7 @@
   </w:style>
   <w:style w:type="paragraph" w:styleId="Heading1">
     <w:name w:val="heading 1"/>
-    <w:basedOn w:val="Style13"/>
+    <w:basedOn w:val="user1"/>
     <w:next w:val="Textbody"/>
     <w:uiPriority w:val="9"/>
     <w:qFormat/>
@@ -8150,7 +7871,7 @@
   </w:style>
   <w:style w:type="paragraph" w:styleId="Heading2">
     <w:name w:val="heading 2"/>
-    <w:basedOn w:val="Style13"/>
+    <w:basedOn w:val="user1"/>
     <w:next w:val="Textbody"/>
     <w:uiPriority w:val="9"/>
     <w:unhideWhenUsed/>
@@ -8182,8 +7903,8 @@
       <w:u w:val="single"/>
     </w:rPr>
   </w:style>
-  <w:style w:type="character" w:styleId="Style12" w:customStyle="1">
-    <w:name w:val="Ссылка указателя"/>
+  <w:style w:type="character" w:styleId="user" w:customStyle="1">
+    <w:name w:val="Ссылка указателя (user)"/>
     <w:qFormat/>
     <w:rPr/>
   </w:style>
@@ -8194,17 +7915,22 @@
       <w:u w:val="single"/>
     </w:rPr>
   </w:style>
-  <w:style w:type="paragraph" w:styleId="Style13" w:customStyle="1">
+  <w:style w:type="character" w:styleId="Style12">
+    <w:name w:val="Ссылка указателя"/>
+    <w:qFormat/>
+    <w:rPr/>
+  </w:style>
+  <w:style w:type="paragraph" w:styleId="Style13">
     <w:name w:val="Заголовок"/>
-    <w:basedOn w:val="Standard"/>
-    <w:next w:val="Textbody"/>
+    <w:basedOn w:val="Normal"/>
+    <w:next w:val="BodyText"/>
     <w:qFormat/>
     <w:pPr>
       <w:keepNext w:val="true"/>
       <w:spacing w:before="240" w:after="120"/>
     </w:pPr>
     <w:rPr>
-      <w:rFonts w:ascii="Liberation Sans" w:hAnsi="Liberation Sans" w:eastAsia="Noto Sans CJK SC"/>
+      <w:rFonts w:ascii="Liberation Sans" w:hAnsi="Liberation Sans" w:eastAsia="Source Han Sans CN" w:cs="FreeSans"/>
       <w:sz w:val="28"/>
       <w:szCs w:val="28"/>
     </w:rPr>
@@ -8236,8 +7962,34 @@
       <w:iCs/>
     </w:rPr>
   </w:style>
-  <w:style w:type="paragraph" w:styleId="Style14" w:customStyle="1">
+  <w:style w:type="paragraph" w:styleId="Style14">
     <w:name w:val="Указатель"/>
+    <w:basedOn w:val="Normal"/>
+    <w:qFormat/>
+    <w:pPr>
+      <w:suppressLineNumbers/>
+    </w:pPr>
+    <w:rPr>
+      <w:rFonts w:cs="FreeSans"/>
+    </w:rPr>
+  </w:style>
+  <w:style w:type="paragraph" w:styleId="user1" w:customStyle="1">
+    <w:name w:val="Заголовок (user)"/>
+    <w:basedOn w:val="Standard"/>
+    <w:next w:val="Textbody"/>
+    <w:qFormat/>
+    <w:pPr>
+      <w:keepNext w:val="true"/>
+      <w:spacing w:before="240" w:after="120"/>
+    </w:pPr>
+    <w:rPr>
+      <w:rFonts w:ascii="Liberation Sans" w:hAnsi="Liberation Sans" w:eastAsia="Noto Sans CJK SC"/>
+      <w:sz w:val="28"/>
+      <w:szCs w:val="28"/>
+    </w:rPr>
+  </w:style>
+  <w:style w:type="paragraph" w:styleId="user2" w:customStyle="1">
+    <w:name w:val="Указатель (user)"/>
     <w:basedOn w:val="Standard"/>
     <w:qFormat/>
     <w:pPr>
@@ -8276,7 +8028,7 @@
   </w:style>
   <w:style w:type="paragraph" w:styleId="IndexHeading">
     <w:name w:val="index heading"/>
-    <w:basedOn w:val="Style13"/>
+    <w:basedOn w:val="user1"/>
     <w:pPr>
       <w:suppressLineNumbers/>
     </w:pPr>
@@ -8294,8 +8046,8 @@
     <w:pPr/>
     <w:rPr/>
   </w:style>
-  <w:style w:type="paragraph" w:styleId="Style15" w:customStyle="1">
-    <w:name w:val="Колонтитулы"/>
+  <w:style w:type="paragraph" w:styleId="user3" w:customStyle="1">
+    <w:name w:val="Колонтитулы (user)"/>
     <w:basedOn w:val="Standard"/>
     <w:qFormat/>
     <w:pPr>
@@ -8308,15 +8060,22 @@
     </w:pPr>
     <w:rPr/>
   </w:style>
+  <w:style w:type="paragraph" w:styleId="Style15">
+    <w:name w:val="Колонтитулы"/>
+    <w:basedOn w:val="Normal"/>
+    <w:qFormat/>
+    <w:pPr/>
+    <w:rPr/>
+  </w:style>
   <w:style w:type="paragraph" w:styleId="Footer">
     <w:name w:val="footer"/>
-    <w:basedOn w:val="Style15"/>
+    <w:basedOn w:val="user3"/>
     <w:pPr/>
     <w:rPr/>
   </w:style>
   <w:style w:type="paragraph" w:styleId="Contents1" w:customStyle="1">
     <w:name w:val="Contents 1"/>
-    <w:basedOn w:val="Style14"/>
+    <w:basedOn w:val="user2"/>
     <w:qFormat/>
     <w:pPr>
       <w:tabs>
@@ -8328,7 +8087,7 @@
   </w:style>
   <w:style w:type="paragraph" w:styleId="Contents2" w:customStyle="1">
     <w:name w:val="Contents 2"/>
-    <w:basedOn w:val="Style14"/>
+    <w:basedOn w:val="user2"/>
     <w:qFormat/>
     <w:pPr>
       <w:tabs>
@@ -8339,22 +8098,29 @@
     </w:pPr>
     <w:rPr/>
   </w:style>
-  <w:style w:type="paragraph" w:styleId="Style16" w:customStyle="1">
-    <w:name w:val="Фигура"/>
+  <w:style w:type="paragraph" w:styleId="user4" w:customStyle="1">
+    <w:name w:val="Фигура (user)"/>
     <w:basedOn w:val="Caption"/>
     <w:qFormat/>
     <w:pPr/>
     <w:rPr/>
   </w:style>
-  <w:style w:type="paragraph" w:styleId="Style17" w:customStyle="1">
-    <w:name w:val="Содержимое врезки"/>
+  <w:style w:type="paragraph" w:styleId="user5" w:customStyle="1">
+    <w:name w:val="Содержимое врезки (user)"/>
     <w:basedOn w:val="Standard"/>
     <w:qFormat/>
     <w:pPr/>
     <w:rPr/>
   </w:style>
-  <w:style w:type="numbering" w:styleId="Style18" w:default="1">
-    <w:name w:val="Без списка"/>
+  <w:style w:type="paragraph" w:styleId="Style16">
+    <w:name w:val="Содержимое врезки"/>
+    <w:basedOn w:val="Normal"/>
+    <w:qFormat/>
+    <w:pPr/>
+    <w:rPr/>
+  </w:style>
+  <w:style w:type="numbering" w:styleId="user6" w:default="1">
+    <w:name w:val="Без списка (user)"/>
     <w:uiPriority w:val="99"/>
     <w:semiHidden/>
     <w:unhideWhenUsed/>

</xml_diff>